<commit_message>
Progressed through the Lab1 to delivery 7
</commit_message>
<xml_diff>
--- a/Lab1Deliverables.docx
+++ b/Lab1Deliverables.docx
@@ -89,6 +89,7 @@
       </w:pPr>
       <w:r>
         <w:rPr>
+          <w:noProof/>
           <w:sz w:val="20"/>
           <w:szCs w:val="20"/>
           <w:lang w:val="en-GB"/>
@@ -162,6 +163,7 @@
       </w:pPr>
       <w:r>
         <w:rPr>
+          <w:noProof/>
           <w:sz w:val="20"/>
           <w:szCs w:val="20"/>
           <w:lang w:val="en-GB"/>
@@ -235,6 +237,7 @@
       </w:pPr>
       <w:r>
         <w:rPr>
+          <w:noProof/>
           <w:sz w:val="20"/>
           <w:szCs w:val="20"/>
           <w:lang w:val="en-GB"/>
@@ -308,6 +311,7 @@
       </w:pPr>
       <w:r>
         <w:rPr>
+          <w:noProof/>
           <w:sz w:val="20"/>
           <w:szCs w:val="20"/>
           <w:lang w:val="en-GB"/>
@@ -391,6 +395,7 @@
       </w:pPr>
       <w:r>
         <w:rPr>
+          <w:noProof/>
           <w:sz w:val="20"/>
           <w:szCs w:val="20"/>
           <w:lang w:val="en-GB"/>
@@ -459,7 +464,6 @@
         <w:rPr>
           <w:sz w:val="20"/>
           <w:szCs w:val="20"/>
-          <w:lang w:val="en-GB"/>
         </w:rPr>
       </w:pPr>
       <w:r>
@@ -477,48 +481,52 @@
           <w:lang w:val="en-GB"/>
         </w:rPr>
         <w:br/>
-        <w:t>y</w:t>
-      </w:r>
-      <w:r>
-        <w:rPr>
-          <w:sz w:val="20"/>
-          <w:szCs w:val="20"/>
-          <w:lang w:val="en-GB"/>
-        </w:rPr>
-        <w:t xml:space="preserve">=mx + b; m = 0.010 (V/C); b = 0.5 (V); Where x is degrees C and y is </w:t>
-      </w:r>
-      <w:r>
-        <w:rPr>
-          <w:sz w:val="20"/>
-          <w:szCs w:val="20"/>
-          <w:lang w:val="en-GB"/>
-        </w:rPr>
-        <w:t>V</w:t>
-      </w:r>
-      <w:r>
-        <w:rPr>
-          <w:sz w:val="20"/>
-          <w:szCs w:val="20"/>
-          <w:lang w:val="en-GB"/>
-        </w:rPr>
-        <w:t>olts</w:t>
-      </w:r>
-    </w:p>
-    <w:p>
-      <w:pPr>
-        <w:rPr>
-          <w:sz w:val="20"/>
-          <w:szCs w:val="20"/>
-          <w:lang w:val="en-GB"/>
-        </w:rPr>
-      </w:pPr>
-      <w:r>
-        <w:rPr>
-          <w:sz w:val="20"/>
-          <w:szCs w:val="20"/>
-          <w:lang w:val="en-GB"/>
-        </w:rPr>
-        <w:t>y = 0.01 * x + 0.5</w:t>
+      </w:r>
+      <w:r>
+        <w:rPr>
+          <w:sz w:val="20"/>
+          <w:szCs w:val="20"/>
+        </w:rPr>
+        <w:t>V = (DN / 4095) * 2.1</w:t>
+      </w:r>
+      <w:r>
+        <w:rPr>
+          <w:sz w:val="20"/>
+          <w:szCs w:val="20"/>
+        </w:rPr>
+        <w:t xml:space="preserve">as </w:t>
+      </w:r>
+      <w:proofErr w:type="gramStart"/>
+      <w:r>
+        <w:rPr>
+          <w:sz w:val="20"/>
+          <w:szCs w:val="20"/>
+        </w:rPr>
+        <w:t>12 bit</w:t>
+      </w:r>
+      <w:proofErr w:type="gramEnd"/>
+      <w:r>
+        <w:rPr>
+          <w:sz w:val="20"/>
+          <w:szCs w:val="20"/>
+        </w:rPr>
+        <w:t xml:space="preserve"> ADC and </w:t>
+      </w:r>
+      <w:proofErr w:type="spellStart"/>
+      <w:r>
+        <w:rPr>
+          <w:sz w:val="20"/>
+          <w:szCs w:val="20"/>
+        </w:rPr>
+        <w:t>Vref</w:t>
+      </w:r>
+      <w:proofErr w:type="spellEnd"/>
+      <w:r>
+        <w:rPr>
+          <w:sz w:val="20"/>
+          <w:szCs w:val="20"/>
+        </w:rPr>
+        <w:t xml:space="preserve"> = 2.1V</w:t>
       </w:r>
       <w:r>
         <w:rPr>
@@ -532,29 +540,421 @@
         <w:rPr>
           <w:sz w:val="20"/>
           <w:szCs w:val="20"/>
+        </w:rPr>
+        <w:t>T(°C) = (V - 0.5) / 0.010</w:t>
+      </w:r>
+      <w:r>
+        <w:rPr>
+          <w:sz w:val="20"/>
+          <w:szCs w:val="20"/>
           <w:lang w:val="en-GB"/>
         </w:rPr>
         <w:br/>
-        <w:t>Therefore Temperature formula is:</w:t>
-      </w:r>
-      <w:r>
-        <w:rPr>
-          <w:sz w:val="20"/>
-          <w:szCs w:val="20"/>
-          <w:lang w:val="en-GB"/>
-        </w:rPr>
+      </w:r>
+    </w:p>
+    <w:p>
+      <w:pPr>
+        <w:rPr>
+          <w:sz w:val="20"/>
+          <w:szCs w:val="20"/>
+          <w:lang w:val="en-GB"/>
+        </w:rPr>
+      </w:pPr>
+      <w:r>
+        <w:rPr>
+          <w:sz w:val="20"/>
+          <w:szCs w:val="20"/>
+        </w:rPr>
+        <w:t xml:space="preserve">Therefore: </w:t>
+      </w:r>
+      <w:r>
+        <w:rPr>
+          <w:sz w:val="20"/>
+          <w:szCs w:val="20"/>
+        </w:rPr>
+        <w:t xml:space="preserve">T(°C) = </w:t>
+      </w:r>
+      <w:proofErr w:type="gramStart"/>
+      <w:r>
+        <w:rPr>
+          <w:sz w:val="20"/>
+          <w:szCs w:val="20"/>
+        </w:rPr>
+        <w:t>( (</w:t>
+      </w:r>
+      <w:proofErr w:type="gramEnd"/>
+      <w:r>
+        <w:rPr>
+          <w:sz w:val="20"/>
+          <w:szCs w:val="20"/>
+        </w:rPr>
+        <w:t xml:space="preserve">DN / 4095) * 2.1 - </w:t>
+      </w:r>
+      <w:proofErr w:type="gramStart"/>
+      <w:r>
+        <w:rPr>
+          <w:sz w:val="20"/>
+          <w:szCs w:val="20"/>
+        </w:rPr>
+        <w:t>0.5 )</w:t>
+      </w:r>
+      <w:proofErr w:type="gramEnd"/>
+      <w:r>
+        <w:rPr>
+          <w:sz w:val="20"/>
+          <w:szCs w:val="20"/>
+        </w:rPr>
+        <w:t xml:space="preserve"> / 0.010</w:t>
+      </w:r>
+    </w:p>
+    <w:p>
+      <w:pPr>
+        <w:pStyle w:val="ListParagraph"/>
+        <w:numPr>
+          <w:ilvl w:val="0"/>
+          <w:numId w:val="4"/>
+        </w:numPr>
+        <w:rPr>
+          <w:sz w:val="20"/>
+          <w:szCs w:val="20"/>
+          <w:lang w:val="en-GB"/>
+        </w:rPr>
+      </w:pPr>
+      <w:r>
+        <w:rPr>
+          <w:sz w:val="20"/>
+          <w:szCs w:val="20"/>
+          <w:lang w:val="en-GB"/>
+        </w:rPr>
+        <w:t>Serial output screenshot</w:t>
+      </w:r>
+    </w:p>
+    <w:p>
+      <w:pPr>
+        <w:rPr>
+          <w:sz w:val="20"/>
+          <w:szCs w:val="20"/>
+          <w:lang w:val="en-GB"/>
+        </w:rPr>
+      </w:pPr>
+      <w:r>
+        <w:rPr>
+          <w:sz w:val="20"/>
+          <w:szCs w:val="20"/>
+          <w:lang w:val="en-GB"/>
+        </w:rPr>
+        <w:lastRenderedPageBreak/>
         <w:br/>
-        <w:t>x = (y – 0.5)/0.01 = 100 * (y – 0.5)</w:t>
-      </w:r>
-    </w:p>
-    <w:p>
-      <w:pPr>
-        <w:rPr>
-          <w:sz w:val="20"/>
-          <w:szCs w:val="20"/>
-          <w:lang w:val="en-GB"/>
-        </w:rPr>
-      </w:pPr>
+      </w:r>
+      <w:r>
+        <w:rPr>
+          <w:lang w:val="en-GB"/>
+        </w:rPr>
+        <w:drawing>
+          <wp:inline distT="0" distB="0" distL="0" distR="0" wp14:anchorId="6D7FE59C" wp14:editId="175D72D9">
+            <wp:extent cx="5943600" cy="2390140"/>
+            <wp:effectExtent l="0" t="0" r="0" b="0"/>
+            <wp:docPr id="1028129258" name="Picture 1"/>
+            <wp:cNvGraphicFramePr>
+              <a:graphicFrameLocks xmlns:a="http://schemas.openxmlformats.org/drawingml/2006/main" noChangeAspect="1"/>
+            </wp:cNvGraphicFramePr>
+            <a:graphic xmlns:a="http://schemas.openxmlformats.org/drawingml/2006/main">
+              <a:graphicData uri="http://schemas.openxmlformats.org/drawingml/2006/picture">
+                <pic:pic xmlns:pic="http://schemas.openxmlformats.org/drawingml/2006/picture">
+                  <pic:nvPicPr>
+                    <pic:cNvPr id="1028129258" name=""/>
+                    <pic:cNvPicPr/>
+                  </pic:nvPicPr>
+                  <pic:blipFill>
+                    <a:blip r:embed="rId10"/>
+                    <a:stretch>
+                      <a:fillRect/>
+                    </a:stretch>
+                  </pic:blipFill>
+                  <pic:spPr>
+                    <a:xfrm>
+                      <a:off x="0" y="0"/>
+                      <a:ext cx="5943600" cy="2390140"/>
+                    </a:xfrm>
+                    <a:prstGeom prst="rect">
+                      <a:avLst/>
+                    </a:prstGeom>
+                  </pic:spPr>
+                </pic:pic>
+              </a:graphicData>
+            </a:graphic>
+          </wp:inline>
+        </w:drawing>
+      </w:r>
+    </w:p>
+    <w:p>
+      <w:pPr>
+        <w:pStyle w:val="ListParagraph"/>
+        <w:numPr>
+          <w:ilvl w:val="0"/>
+          <w:numId w:val="4"/>
+        </w:numPr>
+        <w:rPr>
+          <w:sz w:val="20"/>
+          <w:szCs w:val="20"/>
+          <w:lang w:val="en-GB"/>
+        </w:rPr>
+      </w:pPr>
+      <w:r>
+        <w:rPr>
+          <w:sz w:val="20"/>
+          <w:szCs w:val="20"/>
+          <w:lang w:val="en-GB"/>
+        </w:rPr>
+        <w:t>TMP36 complete script</w:t>
+      </w:r>
+    </w:p>
+    <w:p>
+      <w:pPr>
+        <w:rPr>
+          <w:sz w:val="20"/>
+          <w:szCs w:val="20"/>
+          <w:lang w:val="en-GB"/>
+        </w:rPr>
+      </w:pPr>
+      <w:r>
+        <w:rPr>
+          <w:sz w:val="20"/>
+          <w:szCs w:val="20"/>
+          <w:lang w:val="en-GB"/>
+        </w:rPr>
+        <w:lastRenderedPageBreak/>
+        <w:drawing>
+          <wp:inline distT="0" distB="0" distL="0" distR="0" wp14:anchorId="226ACDA9" wp14:editId="31453D1F">
+            <wp:extent cx="5943600" cy="6101080"/>
+            <wp:effectExtent l="0" t="0" r="0" b="0"/>
+            <wp:docPr id="1532472904" name="Picture 1"/>
+            <wp:cNvGraphicFramePr>
+              <a:graphicFrameLocks xmlns:a="http://schemas.openxmlformats.org/drawingml/2006/main" noChangeAspect="1"/>
+            </wp:cNvGraphicFramePr>
+            <a:graphic xmlns:a="http://schemas.openxmlformats.org/drawingml/2006/main">
+              <a:graphicData uri="http://schemas.openxmlformats.org/drawingml/2006/picture">
+                <pic:pic xmlns:pic="http://schemas.openxmlformats.org/drawingml/2006/picture">
+                  <pic:nvPicPr>
+                    <pic:cNvPr id="1532472904" name=""/>
+                    <pic:cNvPicPr/>
+                  </pic:nvPicPr>
+                  <pic:blipFill>
+                    <a:blip r:embed="rId11"/>
+                    <a:stretch>
+                      <a:fillRect/>
+                    </a:stretch>
+                  </pic:blipFill>
+                  <pic:spPr>
+                    <a:xfrm>
+                      <a:off x="0" y="0"/>
+                      <a:ext cx="5943600" cy="6101080"/>
+                    </a:xfrm>
+                    <a:prstGeom prst="rect">
+                      <a:avLst/>
+                    </a:prstGeom>
+                  </pic:spPr>
+                </pic:pic>
+              </a:graphicData>
+            </a:graphic>
+          </wp:inline>
+        </w:drawing>
+      </w:r>
+    </w:p>
+    <w:p>
+      <w:pPr>
+        <w:pStyle w:val="ListParagraph"/>
+        <w:numPr>
+          <w:ilvl w:val="0"/>
+          <w:numId w:val="4"/>
+        </w:numPr>
+        <w:rPr>
+          <w:sz w:val="20"/>
+          <w:szCs w:val="20"/>
+          <w:lang w:val="en-GB"/>
+        </w:rPr>
+      </w:pPr>
+      <w:r>
+        <w:rPr>
+          <w:sz w:val="20"/>
+          <w:szCs w:val="20"/>
+          <w:lang w:val="en-GB"/>
+        </w:rPr>
+        <w:t>Max</w:t>
+      </w:r>
+      <w:r>
+        <w:rPr>
+          <w:sz w:val="20"/>
+          <w:szCs w:val="20"/>
+          <w:lang w:val="en-GB"/>
+        </w:rPr>
+        <w:t>, m</w:t>
+      </w:r>
+      <w:r>
+        <w:rPr>
+          <w:sz w:val="20"/>
+          <w:szCs w:val="20"/>
+          <w:lang w:val="en-GB"/>
+        </w:rPr>
+        <w:t>in</w:t>
+      </w:r>
+      <w:r>
+        <w:rPr>
+          <w:sz w:val="20"/>
+          <w:szCs w:val="20"/>
+          <w:lang w:val="en-GB"/>
+        </w:rPr>
+        <w:t xml:space="preserve">, and delta </w:t>
+      </w:r>
+      <w:r>
+        <w:rPr>
+          <w:sz w:val="20"/>
+          <w:szCs w:val="20"/>
+          <w:lang w:val="en-GB"/>
+        </w:rPr>
+        <w:t>temp over 1 minute</w:t>
+      </w:r>
+    </w:p>
+    <w:p>
+      <w:pPr>
+        <w:rPr>
+          <w:sz w:val="20"/>
+          <w:szCs w:val="20"/>
+          <w:lang w:val="en-GB"/>
+        </w:rPr>
+      </w:pPr>
+    </w:p>
+    <w:p>
+      <w:pPr>
+        <w:pStyle w:val="ListParagraph"/>
+        <w:numPr>
+          <w:ilvl w:val="0"/>
+          <w:numId w:val="4"/>
+        </w:numPr>
+        <w:rPr>
+          <w:sz w:val="20"/>
+          <w:szCs w:val="20"/>
+          <w:lang w:val="en-GB"/>
+        </w:rPr>
+      </w:pPr>
+      <w:r>
+        <w:rPr>
+          <w:sz w:val="20"/>
+          <w:szCs w:val="20"/>
+          <w:lang w:val="en-GB"/>
+        </w:rPr>
+        <w:t>Another temperature sensor type</w:t>
+      </w:r>
+    </w:p>
+    <w:p>
+      <w:pPr>
+        <w:rPr>
+          <w:sz w:val="20"/>
+          <w:szCs w:val="20"/>
+          <w:lang w:val="en-GB"/>
+        </w:rPr>
+      </w:pPr>
+      <w:r>
+        <w:rPr>
+          <w:sz w:val="20"/>
+          <w:szCs w:val="20"/>
+          <w:lang w:val="en-GB"/>
+        </w:rPr>
+        <w:t>Thermocouple (Type K)</w:t>
+      </w:r>
+    </w:p>
+    <w:p>
+      <w:pPr>
+        <w:rPr>
+          <w:sz w:val="20"/>
+          <w:szCs w:val="20"/>
+          <w:lang w:val="en-GB"/>
+        </w:rPr>
+      </w:pPr>
+      <w:r>
+        <w:rPr>
+          <w:sz w:val="20"/>
+          <w:szCs w:val="20"/>
+          <w:lang w:val="en-GB"/>
+        </w:rPr>
+        <w:t xml:space="preserve">When two dissimilar metals are joined at a junction, a temperature-dependent voltage of ~41µV/°C is generated via the </w:t>
+      </w:r>
+      <w:proofErr w:type="spellStart"/>
+      <w:r>
+        <w:rPr>
+          <w:sz w:val="20"/>
+          <w:szCs w:val="20"/>
+          <w:lang w:val="en-GB"/>
+        </w:rPr>
+        <w:t>Seebeck</w:t>
+      </w:r>
+      <w:proofErr w:type="spellEnd"/>
+      <w:r>
+        <w:rPr>
+          <w:sz w:val="20"/>
+          <w:szCs w:val="20"/>
+          <w:lang w:val="en-GB"/>
+        </w:rPr>
+        <w:t xml:space="preserve"> effect. This voltage is too small for an ADC to read directly, so an amplifier IC boosts it and performs cold-junction compensation before sending the result to the MCU over SPI. The main advantage over the TMP36 is range where thermocouple has a range of -200 to 1350°C vs the TMP36’s -40 to </w:t>
+      </w:r>
+      <w:r>
+        <w:rPr>
+          <w:sz w:val="20"/>
+          <w:szCs w:val="20"/>
+          <w:lang w:val="en-GB"/>
+        </w:rPr>
+        <w:lastRenderedPageBreak/>
+        <w:t>125°C. Thermocouples are the standard choice for high-temperature industrial applications like furnaces and engines.</w:t>
+      </w:r>
+    </w:p>
+    <w:p>
+      <w:pPr>
+        <w:rPr>
+          <w:sz w:val="20"/>
+          <w:szCs w:val="20"/>
+          <w:lang w:val="en-GB"/>
+        </w:rPr>
+      </w:pPr>
+    </w:p>
+    <w:p>
+      <w:pPr>
+        <w:rPr>
+          <w:sz w:val="20"/>
+          <w:szCs w:val="20"/>
+          <w:lang w:val="en-GB"/>
+        </w:rPr>
+      </w:pPr>
+      <w:r>
+        <w:rPr>
+          <w:sz w:val="20"/>
+          <w:szCs w:val="20"/>
+          <w:lang w:val="en-GB"/>
+        </w:rPr>
+        <w:br w:type="page"/>
+      </w:r>
+    </w:p>
+    <w:p>
+      <w:pPr>
+        <w:pStyle w:val="ListParagraph"/>
+        <w:numPr>
+          <w:ilvl w:val="0"/>
+          <w:numId w:val="4"/>
+        </w:numPr>
+        <w:rPr>
+          <w:sz w:val="20"/>
+          <w:szCs w:val="20"/>
+          <w:lang w:val="en-GB"/>
+        </w:rPr>
+      </w:pPr>
+      <w:r>
+        <w:rPr>
+          <w:sz w:val="20"/>
+          <w:szCs w:val="20"/>
+          <w:lang w:val="en-GB"/>
+        </w:rPr>
+        <w:lastRenderedPageBreak/>
+        <w:t>I2C wiring</w:t>
+      </w:r>
     </w:p>
     <w:p>
       <w:pPr>
@@ -1558,7 +1958,6 @@
   <w:style w:type="character" w:default="1" w:styleId="DefaultParagraphFont">
     <w:name w:val="Default Paragraph Font"/>
     <w:uiPriority w:val="1"/>
-    <w:semiHidden/>
     <w:unhideWhenUsed/>
   </w:style>
   <w:style w:type="table" w:default="1" w:styleId="TableNormal">

</xml_diff>